<commit_message>
Update sync docs for Slack failure notifications (v1.1)
Documents the new on-failure Slack post added in b107b331: message
format, the DRY_RUN gate it shares with the success messages, and
that a Slack-send failure doesn't swallow the original error.

Co-Authored-By: Claude Sonnet 5 <noreply@anthropic.com>
</commit_message>
<xml_diff>
--- a/docs/bcycle-first-timers-to-bigquery.docx
+++ b/docs/bcycle-first-timers-to-bigquery.docx
@@ -33,7 +33,7 @@
           <w:sz w:val="20"/>
           <w:szCs w:val="20"/>
         </w:rPr>
-        <w:t xml:space="preserve">Version: v1.0 — July 28, 2026</w:t>
+        <w:t xml:space="preserve">Version: v1.1 — July 28, 2026</w:t>
       </w:r>
     </w:p>
     <w:p>
@@ -1339,6 +1339,18 @@
         <w:spacing w:after="120"/>
       </w:pPr>
       <w:r>
+        <w:rPr>
+          <w:b/>
+          <w:bCs/>
+        </w:rPr>
+        <w:t xml:space="preserve">On success:</w:t>
+      </w:r>
+    </w:p>
+    <w:p>
+      <w:pPr>
+        <w:spacing w:after="120"/>
+      </w:pPr>
+      <w:r>
         <w:t xml:space="preserve">After every real (non-dry-run) insert — once per chunk, so a multi-chunk catch-up run posts multiple messages — the script posts to #bigquery-updates via an incoming webhook (SLACK_BIGQUERY_UPDATES_WEBHOOK_URL). Message format:</w:t>
       </w:r>
     </w:p>
@@ -1361,6 +1373,48 @@
         <w:spacing w:after="120"/>
       </w:pPr>
       <w:r>
+        <w:rPr>
+          <w:b/>
+          <w:bCs/>
+        </w:rPr>
+        <w:t xml:space="preserve">On failure:</w:t>
+      </w:r>
+    </w:p>
+    <w:p>
+      <w:pPr>
+        <w:spacing w:after="120"/>
+      </w:pPr>
+      <w:r>
+        <w:t xml:space="preserve">If main() throws for any reason — a MarianaTek report header shape change, a BigQuery auth error, a network failure, anything uncaught — the script also posts a failure notice to the same channel before exiting non-zero, gated on the same non-dry-run check as the success messages (so manual dry-run test runs stay quiet). Message format:</w:t>
+      </w:r>
+    </w:p>
+    <w:p>
+      <w:pPr>
+        <w:shd w:fill="F2F2F2" w:val="clear"/>
+        <w:spacing w:after="60"/>
+      </w:pPr>
+      <w:r>
+        <w:rPr>
+          <w:rFonts w:ascii="Consolas" w:cs="Consolas" w:eastAsia="Consolas" w:hAnsi="Consolas"/>
+          <w:sz w:val="20"/>
+          <w:szCs w:val="20"/>
+        </w:rPr>
+        <w:t xml:space="preserve">⚠️ b.cycle - First Timers sync failed: Report headers changed shape — refusing to guess. Got: [...]</w:t>
+      </w:r>
+    </w:p>
+    <w:p>
+      <w:pPr>
+        <w:spacing w:after="120"/>
+      </w:pPr>
+      <w:r>
+        <w:t xml:space="preserve">If the Slack post itself fails (e.g. the webhook is down), that failure is caught separately and logged — it does not swallow the original error or change the script's exit code, so the GitHub Actions run still fails loudly either way.</w:t>
+      </w:r>
+    </w:p>
+    <w:p>
+      <w:pPr>
+        <w:spacing w:after="120"/>
+      </w:pPr>
+      <w:r>
         <w:t xml:space="preserve">If the webhook secret is unset, the script logs the message instead of sending it and continues without failing.</w:t>
       </w:r>
     </w:p>
@@ -1430,7 +1484,7 @@
         <w:spacing w:after="120"/>
       </w:pPr>
       <w:r>
-        <w:t xml:space="preserve">Fix: the script hard-fails rather than guessing if MarianaTek changes the report's column shape — compare the error's reported headers against the EXPECTED_HEADERS constant in the script and update both the constant and the row mapper together.</w:t>
+        <w:t xml:space="preserve">Fix: the script hard-fails rather than guessing if MarianaTek changes the report's column shape — compare the error's reported headers against the EXPECTED_HEADERS constant in the script and update both the constant and the row mapper together. As of v1.1 this failure also posts a warning to #bigquery-updates (see section 10), so you don't have to check the Actions tab to notice it.</w:t>
       </w:r>
     </w:p>
     <w:p>

</xml_diff>